<commit_message>
Réunion de cadrage décalée au mardi 13 octobre
Co-Authored-By: Claude Fable 5.1 <noreply@anthropic.com>
Claude-Session: https://claude.ai/code/session_0179U1EgeN6zS3U2LunpEbFp
</commit_message>
<xml_diff>
--- a/docs/offre/cadrage/Kit_reunion_de_cadrage_EGUITRA.docx
+++ b/docs/offre/cadrage/Kit_reunion_de_cadrage_EGUITRA.docx
@@ -75,7 +75,7 @@
           <w:sz w:val="28"/>
           <w:szCs w:val="28"/>
         </w:rPr>
-        <w:t xml:space="preserve">EGUITRA Finance et AxisPro Suite, lundi 12 octobre 2026</w:t>
+        <w:t xml:space="preserve">EGUITRA Finance et AxisPro Suite, mardi 13 octobre 2026</w:t>
       </w:r>
     </w:p>
     <w:p>
@@ -10812,7 +10812,7 @@
           <w:sz w:val="21"/>
           <w:szCs w:val="21"/>
         </w:rPr>
-        <w:t xml:space="preserve">Objet : Compte rendu de la réunion de cadrage du 12 octobre 2026</w:t>
+        <w:t xml:space="preserve">Objet : Compte rendu de la réunion de cadrage du 13 octobre 2026</w:t>
       </w:r>
     </w:p>
     <w:p>

</xml_diff>

<commit_message>
Réunion de cadrage ramenée à deux heures, ordre du jour d'une page
Les ateliers transport, BTP et immobilier passent en séances de trente
minutes dans la semaine. Présentation, kit et mail alignés.

Co-Authored-By: Claude Fable 5.1 <noreply@anthropic.com>
Claude-Session: https://claude.ai/code/session_0179U1EgeN6zS3U2LunpEbFp
</commit_message>
<xml_diff>
--- a/docs/offre/cadrage/Kit_reunion_de_cadrage_EGUITRA.docx
+++ b/docs/offre/cadrage/Kit_reunion_de_cadrage_EGUITRA.docx
@@ -288,7 +288,7 @@
           <w:sz w:val="22"/>
           <w:szCs w:val="22"/>
         </w:rPr>
-        <w:t xml:space="preserve">Concrètement, à la fin de la demi-journée, vous devez pouvoir répondre à ces questions sans hésiter :</w:t>
+        <w:t xml:space="preserve">Concrètement, à la fin des deux heures, vous devez pouvoir répondre à ces questions sans hésiter :</w:t>
       </w:r>
     </w:p>
     <w:p>
@@ -381,7 +381,7 @@
           <w:sz w:val="21"/>
           <w:szCs w:val="21"/>
         </w:rPr>
-        <w:t xml:space="preserve">Le livrable de la réunion est le compte rendu envoyé sous 24 heures, puis le dossier de conception signé le vendredi 16 octobre. Tout ce qui n'est pas écrit dans l'un ou l'autre n'existe pas.</w:t>
+        <w:t xml:space="preserve">Le livrable de la réunion est le compte rendu envoyé sous 24 heures, puis le dossier de conception signé le vendredi 16 octobre. La réunion dure deux heures ; les ateliers métiers transport, BTP et immobilier se tiennent dans la semaine, trente minutes chacun, avec le seul référent concerné. Tout ce qui n'est pas écrit dans l'un ou l'autre n'existe pas.</w:t>
       </w:r>
     </w:p>
     <w:p>
@@ -818,7 +818,7 @@
                 <w:sz w:val="19"/>
                 <w:szCs w:val="19"/>
               </w:rPr>
-              <w:t xml:space="preserve">Un référent exploitation transport</w:t>
+              <w:t xml:space="preserve">Les référents transport, chantiers et immobilier</w:t>
             </w:r>
           </w:p>
         </w:tc>
@@ -852,7 +852,7 @@
                 <w:sz w:val="19"/>
                 <w:szCs w:val="19"/>
               </w:rPr>
-              <w:t xml:space="preserve">Rotations, flotte, routes, coûts, conditions de saisie au parc.</w:t>
+              <w:t xml:space="preserve">Présents à l'ouverture si possible, pour être nommés et fixer leur atelier de trente minutes dans la semaine. Leur présence sur les deux heures n'est pas nécessaire.</w:t>
             </w:r>
           </w:p>
         </w:tc>
@@ -887,7 +887,7 @@
                 <w:sz w:val="19"/>
                 <w:szCs w:val="19"/>
               </w:rPr>
-              <w:t xml:space="preserve">Un référent chantiers et un référent immobilier</w:t>
+              <w:t xml:space="preserve">Un référent du cabinet MB AxisPro</w:t>
             </w:r>
           </w:p>
         </w:tc>
@@ -900,76 +900,6 @@
               <w:bottom w:val="single" w:color="C9CFD8" w:sz="4"/>
               <w:right w:val="single" w:color="C9CFD8" w:sz="4"/>
             </w:tcBorders>
-            <w:tcMar>
-              <w:top w:type="dxa" w:w="60"/>
-              <w:left w:type="dxa" w:w="100"/>
-              <w:bottom w:type="dxa" w:w="60"/>
-              <w:right w:type="dxa" w:w="100"/>
-            </w:tcMar>
-            <w:vAlign w:val="center"/>
-          </w:tcPr>
-          <w:p>
-            <w:pPr>
-              <w:spacing w:after="0"/>
-            </w:pPr>
-            <w:r>
-              <w:rPr>
-                <w:rFonts w:ascii="Calibri" w:cs="Calibri" w:eastAsia="Calibri" w:hAnsi="Calibri"/>
-                <w:b w:val="false"/>
-                <w:bCs w:val="false"/>
-                <w:sz w:val="19"/>
-                <w:szCs w:val="19"/>
-              </w:rPr>
-              <w:t xml:space="preserve">Peuvent être la même personne. Situations, retenues, baux, loyers.</w:t>
-            </w:r>
-          </w:p>
-        </w:tc>
-      </w:tr>
-      <w:tr>
-        <w:tc>
-          <w:tcPr>
-            <w:tcW w:type="dxa" w:w="3600"/>
-            <w:tcBorders>
-              <w:top w:val="single" w:color="C9CFD8" w:sz="4"/>
-              <w:left w:val="single" w:color="C9CFD8" w:sz="4"/>
-              <w:bottom w:val="single" w:color="C9CFD8" w:sz="4"/>
-              <w:right w:val="single" w:color="C9CFD8" w:sz="4"/>
-            </w:tcBorders>
-            <w:shd w:fill="F2F4F7" w:color="auto" w:val="clear"/>
-            <w:tcMar>
-              <w:top w:type="dxa" w:w="60"/>
-              <w:left w:type="dxa" w:w="100"/>
-              <w:bottom w:type="dxa" w:w="60"/>
-              <w:right w:type="dxa" w:w="100"/>
-            </w:tcMar>
-            <w:vAlign w:val="center"/>
-          </w:tcPr>
-          <w:p>
-            <w:pPr>
-              <w:spacing w:after="0"/>
-            </w:pPr>
-            <w:r>
-              <w:rPr>
-                <w:rFonts w:ascii="Calibri" w:cs="Calibri" w:eastAsia="Calibri" w:hAnsi="Calibri"/>
-                <w:b w:val="false"/>
-                <w:bCs w:val="false"/>
-                <w:sz w:val="19"/>
-                <w:szCs w:val="19"/>
-              </w:rPr>
-              <w:t xml:space="preserve">Un référent du cabinet MB AxisPro</w:t>
-            </w:r>
-          </w:p>
-        </w:tc>
-        <w:tc>
-          <w:tcPr>
-            <w:tcW w:type="dxa" w:w="6038"/>
-            <w:tcBorders>
-              <w:top w:val="single" w:color="C9CFD8" w:sz="4"/>
-              <w:left w:val="single" w:color="C9CFD8" w:sz="4"/>
-              <w:bottom w:val="single" w:color="C9CFD8" w:sz="4"/>
-              <w:right w:val="single" w:color="C9CFD8" w:sz="4"/>
-            </w:tcBorders>
-            <w:shd w:fill="F2F4F7" w:color="auto" w:val="clear"/>
             <w:tcMar>
               <w:top w:type="dxa" w:w="60"/>
               <w:left w:type="dxa" w:w="100"/>
@@ -1243,7 +1173,7 @@
                 <w:sz w:val="19"/>
                 <w:szCs w:val="19"/>
               </w:rPr>
-              <w:t xml:space="preserve">Envoyer l'ordre du jour et la liste des participants attendus, nommément</w:t>
+              <w:t xml:space="preserve">Envoyer l'ordre du jour d'une page et la liste des participants attendus, nommément</w:t>
             </w:r>
           </w:p>
         </w:tc>
@@ -1450,7 +1380,7 @@
                 <w:sz w:val="19"/>
                 <w:szCs w:val="19"/>
               </w:rPr>
-              <w:t xml:space="preserve">Préparer la démonstration de dix minutes sur votre socle SOGUIPREM</w:t>
+              <w:t xml:space="preserve">Préparer la démonstration de cinq minutes sur votre socle SOGUIPREM</w:t>
             </w:r>
           </w:p>
         </w:tc>
@@ -1483,7 +1413,7 @@
                 <w:sz w:val="19"/>
                 <w:szCs w:val="19"/>
               </w:rPr>
-              <w:t xml:space="preserve">Montrer un tableau de bord et une saisie guidée rend concret ce que « noyau invisible » veut dire. Pas plus de dix minutes.</w:t>
+              <w:t xml:space="preserve">Montrer un tableau de bord et une saisie guidée rend concret ce que « noyau invisible » veut dire. Pas plus de cinq minutes : le format de deux heures ne laisse pas de place à davantage.</w:t>
             </w:r>
           </w:p>
         </w:tc>
@@ -1757,7 +1687,7 @@
           <w:sz w:val="26"/>
           <w:szCs w:val="26"/>
         </w:rPr>
-        <w:t xml:space="preserve">3.1 Déroulé</w:t>
+        <w:t xml:space="preserve">3.1 Déroulé des deux heures</w:t>
       </w:r>
     </w:p>
     <w:tbl>
@@ -1986,7 +1916,7 @@
                 <w:sz w:val="19"/>
                 <w:szCs w:val="19"/>
               </w:rPr>
-              <w:t xml:space="preserve">Ouverture, 15 min</w:t>
+              <w:t xml:space="preserve">Ouverture, 10 min</w:t>
             </w:r>
           </w:p>
         </w:tc>
@@ -2088,7 +2018,7 @@
                 <w:sz w:val="19"/>
                 <w:szCs w:val="19"/>
               </w:rPr>
-              <w:t xml:space="preserve">10 h 15</w:t>
+              <w:t xml:space="preserve">10 h 10</w:t>
             </w:r>
           </w:p>
         </w:tc>
@@ -2122,7 +2052,7 @@
                 <w:sz w:val="19"/>
                 <w:szCs w:val="19"/>
               </w:rPr>
-              <w:t xml:space="preserve">Plateforme, planning, organisation, 30 min</w:t>
+              <w:t xml:space="preserve">Plateforme, planning, organisation, 20 min</w:t>
             </w:r>
           </w:p>
         </w:tc>
@@ -2156,7 +2086,7 @@
                 <w:sz w:val="19"/>
                 <w:szCs w:val="19"/>
               </w:rPr>
-              <w:t xml:space="preserve">Diapositives 4 à 7. Démonstration de dix minutes. Vous faites nommer les référents et fixer l'heure du point quotidien.</w:t>
+              <w:t xml:space="preserve">Diapositives 4 à 7, démonstration de cinq minutes. Vous faites nommer les référents et fixer l'heure du point quotidien.</w:t>
             </w:r>
           </w:p>
         </w:tc>
@@ -2225,7 +2155,7 @@
                 <w:sz w:val="19"/>
                 <w:szCs w:val="19"/>
               </w:rPr>
-              <w:t xml:space="preserve">10 h 45</w:t>
+              <w:t xml:space="preserve">10 h 30</w:t>
             </w:r>
           </w:p>
         </w:tc>
@@ -2258,7 +2188,7 @@
                 <w:sz w:val="19"/>
                 <w:szCs w:val="19"/>
               </w:rPr>
-              <w:t xml:space="preserve">Atelier Finance, 60 min</w:t>
+              <w:t xml:space="preserve">Finance, 35 min</w:t>
             </w:r>
           </w:p>
         </w:tc>
@@ -2291,7 +2221,7 @@
                 <w:sz w:val="19"/>
                 <w:szCs w:val="19"/>
               </w:rPr>
-              <w:t xml:space="preserve">Fiche Finance. Le responsable financier parle, vous questionnez, le collègue note. Vous demandez les documents en séance.</w:t>
+              <w:t xml:space="preserve">Fiche Finance, en allant droit aux onze questions. Le responsable financier parle, vous questionnez, le collègue note. Vous demandez les documents en séance.</w:t>
             </w:r>
           </w:p>
         </w:tc>
@@ -2360,7 +2290,7 @@
                 <w:sz w:val="19"/>
                 <w:szCs w:val="19"/>
               </w:rPr>
-              <w:t xml:space="preserve">11 h 45</w:t>
+              <w:t xml:space="preserve">11 h 05</w:t>
             </w:r>
           </w:p>
         </w:tc>
@@ -2394,7 +2324,7 @@
                 <w:sz w:val="19"/>
                 <w:szCs w:val="19"/>
               </w:rPr>
-              <w:t xml:space="preserve">Pause, 15 min</w:t>
+              <w:t xml:space="preserve">AxisPro Suite, 15 min</w:t>
             </w:r>
           </w:p>
         </w:tc>
@@ -2428,7 +2358,7 @@
                 <w:sz w:val="19"/>
                 <w:szCs w:val="19"/>
               </w:rPr>
-              <w:t xml:space="preserve">Vous relisez les décisions prises avec votre collègue.</w:t>
+              <w:t xml:space="preserve">Fiche AxisPro avec le référent du cabinet et le DGA, sur la grille, les gates, la data room et le portail.</w:t>
             </w:r>
           </w:p>
         </w:tc>
@@ -2462,7 +2392,7 @@
                 <w:sz w:val="19"/>
                 <w:szCs w:val="19"/>
               </w:rPr>
-              <w:t xml:space="preserve">Une liste propre.</w:t>
+              <w:t xml:space="preserve">La grille de référence et les dossiers en cours.</w:t>
             </w:r>
           </w:p>
         </w:tc>
@@ -2497,7 +2427,7 @@
                 <w:sz w:val="19"/>
                 <w:szCs w:val="19"/>
               </w:rPr>
-              <w:t xml:space="preserve">12 h 00</w:t>
+              <w:t xml:space="preserve">11 h 20</w:t>
             </w:r>
           </w:p>
         </w:tc>
@@ -2530,7 +2460,7 @@
                 <w:sz w:val="19"/>
                 <w:szCs w:val="19"/>
               </w:rPr>
-              <w:t xml:space="preserve">Ateliers métiers, 45 min</w:t>
+              <w:t xml:space="preserve">Technique et charte, 15 min</w:t>
             </w:r>
           </w:p>
         </w:tc>
@@ -2563,7 +2493,7 @@
                 <w:sz w:val="19"/>
                 <w:szCs w:val="19"/>
               </w:rPr>
-              <w:t xml:space="preserve">Fiches Transport, BTP, Immobilier, quinze minutes chacune, un référent à la fois.</w:t>
+              <w:t xml:space="preserve">Fiche Technique. Nom de domaine, logos, utilisateurs, relevés bancaires, expert-comptable.</w:t>
             </w:r>
           </w:p>
         </w:tc>
@@ -2596,7 +2526,7 @@
                 <w:sz w:val="19"/>
                 <w:szCs w:val="19"/>
               </w:rPr>
-              <w:t xml:space="preserve">Les listes flotte, chantiers, biens, ou leur date.</w:t>
+              <w:t xml:space="preserve">Les accès et la charte, ou leur date.</w:t>
             </w:r>
           </w:p>
         </w:tc>
@@ -2632,7 +2562,7 @@
                 <w:sz w:val="19"/>
                 <w:szCs w:val="19"/>
               </w:rPr>
-              <w:t xml:space="preserve">12 h 45</w:t>
+              <w:t xml:space="preserve">11 h 35</w:t>
             </w:r>
           </w:p>
         </w:tc>
@@ -2666,7 +2596,7 @@
                 <w:sz w:val="19"/>
                 <w:szCs w:val="19"/>
               </w:rPr>
-              <w:t xml:space="preserve">Atelier AxisPro, 30 min</w:t>
+              <w:t xml:space="preserve">Décisions et prochaines étapes, 20 min</w:t>
             </w:r>
           </w:p>
         </w:tc>
@@ -2700,7 +2630,7 @@
                 <w:sz w:val="19"/>
                 <w:szCs w:val="19"/>
               </w:rPr>
-              <w:t xml:space="preserve">Fiche AxisPro avec le référent du cabinet et le DGA.</w:t>
+              <w:t xml:space="preserve">Vous lisez les huit décisions et la liste des éléments à voix haute, un par un, et vous obtenez un oui ou une date pour chacun. Vous fixez les créneaux des trois ateliers métiers.</w:t>
             </w:r>
           </w:p>
         </w:tc>
@@ -2734,7 +2664,7 @@
                 <w:sz w:val="19"/>
                 <w:szCs w:val="19"/>
               </w:rPr>
-              <w:t xml:space="preserve">La grille de référence et les dossiers en cours.</w:t>
+              <w:t xml:space="preserve">La fiche de décisions remplie et validée.</w:t>
             </w:r>
           </w:p>
         </w:tc>
@@ -2769,7 +2699,7 @@
                 <w:sz w:val="19"/>
                 <w:szCs w:val="19"/>
               </w:rPr>
-              <w:t xml:space="preserve">13 h 15</w:t>
+              <w:t xml:space="preserve">11 h 55</w:t>
             </w:r>
           </w:p>
         </w:tc>
@@ -2802,7 +2732,7 @@
                 <w:sz w:val="19"/>
                 <w:szCs w:val="19"/>
               </w:rPr>
-              <w:t xml:space="preserve">Technique et charte, 20 min</w:t>
+              <w:t xml:space="preserve">Clôture, 5 min</w:t>
             </w:r>
           </w:p>
         </w:tc>
@@ -2835,7 +2765,7 @@
                 <w:sz w:val="19"/>
                 <w:szCs w:val="19"/>
               </w:rPr>
-              <w:t xml:space="preserve">Fiche Technique. Nom de domaine, logos, utilisateurs, relevés bancaires, expert-comptable.</w:t>
+              <w:t xml:space="preserve">Vous annoncez le compte rendu sous 24 heures et la signature du dossier de conception vendredi.</w:t>
             </w:r>
           </w:p>
         </w:tc>
@@ -2868,145 +2798,7 @@
                 <w:sz w:val="19"/>
                 <w:szCs w:val="19"/>
               </w:rPr>
-              <w:t xml:space="preserve">Les accès et la charte, ou leur date.</w:t>
-            </w:r>
-          </w:p>
-        </w:tc>
-      </w:tr>
-      <w:tr>
-        <w:tc>
-          <w:tcPr>
-            <w:tcW w:type="dxa" w:w="1000"/>
-            <w:tcBorders>
-              <w:top w:val="single" w:color="C9CFD8" w:sz="4"/>
-              <w:left w:val="single" w:color="C9CFD8" w:sz="4"/>
-              <w:bottom w:val="single" w:color="C9CFD8" w:sz="4"/>
-              <w:right w:val="single" w:color="C9CFD8" w:sz="4"/>
-            </w:tcBorders>
-            <w:shd w:fill="F2F4F7" w:color="auto" w:val="clear"/>
-            <w:tcMar>
-              <w:top w:type="dxa" w:w="60"/>
-              <w:left w:type="dxa" w:w="100"/>
-              <w:bottom w:type="dxa" w:w="60"/>
-              <w:right w:type="dxa" w:w="100"/>
-            </w:tcMar>
-            <w:vAlign w:val="center"/>
-          </w:tcPr>
-          <w:p>
-            <w:pPr>
-              <w:spacing w:after="0"/>
-            </w:pPr>
-            <w:r>
-              <w:rPr>
-                <w:rFonts w:ascii="Calibri" w:cs="Calibri" w:eastAsia="Calibri" w:hAnsi="Calibri"/>
-                <w:b w:val="false"/>
-                <w:bCs w:val="false"/>
-                <w:sz w:val="19"/>
-                <w:szCs w:val="19"/>
-              </w:rPr>
-              <w:t xml:space="preserve">13 h 35</w:t>
-            </w:r>
-          </w:p>
-        </w:tc>
-        <w:tc>
-          <w:tcPr>
-            <w:tcW w:type="dxa" w:w="2200"/>
-            <w:tcBorders>
-              <w:top w:val="single" w:color="C9CFD8" w:sz="4"/>
-              <w:left w:val="single" w:color="C9CFD8" w:sz="4"/>
-              <w:bottom w:val="single" w:color="C9CFD8" w:sz="4"/>
-              <w:right w:val="single" w:color="C9CFD8" w:sz="4"/>
-            </w:tcBorders>
-            <w:shd w:fill="F2F4F7" w:color="auto" w:val="clear"/>
-            <w:tcMar>
-              <w:top w:type="dxa" w:w="60"/>
-              <w:left w:type="dxa" w:w="100"/>
-              <w:bottom w:type="dxa" w:w="60"/>
-              <w:right w:type="dxa" w:w="100"/>
-            </w:tcMar>
-            <w:vAlign w:val="center"/>
-          </w:tcPr>
-          <w:p>
-            <w:pPr>
-              <w:spacing w:after="0"/>
-            </w:pPr>
-            <w:r>
-              <w:rPr>
-                <w:rFonts w:ascii="Calibri" w:cs="Calibri" w:eastAsia="Calibri" w:hAnsi="Calibri"/>
-                <w:b w:val="false"/>
-                <w:bCs w:val="false"/>
-                <w:sz w:val="19"/>
-                <w:szCs w:val="19"/>
-              </w:rPr>
-              <w:t xml:space="preserve">Décisions et prochaines étapes, 25 min</w:t>
-            </w:r>
-          </w:p>
-        </w:tc>
-        <w:tc>
-          <w:tcPr>
-            <w:tcW w:type="dxa" w:w="3838"/>
-            <w:tcBorders>
-              <w:top w:val="single" w:color="C9CFD8" w:sz="4"/>
-              <w:left w:val="single" w:color="C9CFD8" w:sz="4"/>
-              <w:bottom w:val="single" w:color="C9CFD8" w:sz="4"/>
-              <w:right w:val="single" w:color="C9CFD8" w:sz="4"/>
-            </w:tcBorders>
-            <w:shd w:fill="F2F4F7" w:color="auto" w:val="clear"/>
-            <w:tcMar>
-              <w:top w:type="dxa" w:w="60"/>
-              <w:left w:type="dxa" w:w="100"/>
-              <w:bottom w:type="dxa" w:w="60"/>
-              <w:right w:type="dxa" w:w="100"/>
-            </w:tcMar>
-            <w:vAlign w:val="center"/>
-          </w:tcPr>
-          <w:p>
-            <w:pPr>
-              <w:spacing w:after="0"/>
-            </w:pPr>
-            <w:r>
-              <w:rPr>
-                <w:rFonts w:ascii="Calibri" w:cs="Calibri" w:eastAsia="Calibri" w:hAnsi="Calibri"/>
-                <w:b w:val="false"/>
-                <w:bCs w:val="false"/>
-                <w:sz w:val="19"/>
-                <w:szCs w:val="19"/>
-              </w:rPr>
-              <w:t xml:space="preserve">Vous lisez les huit décisions et la liste des éléments à voix haute, un par un, et vous obtenez un oui ou une date pour chacun.</w:t>
-            </w:r>
-          </w:p>
-        </w:tc>
-        <w:tc>
-          <w:tcPr>
-            <w:tcW w:type="dxa" w:w="2600"/>
-            <w:tcBorders>
-              <w:top w:val="single" w:color="C9CFD8" w:sz="4"/>
-              <w:left w:val="single" w:color="C9CFD8" w:sz="4"/>
-              <w:bottom w:val="single" w:color="C9CFD8" w:sz="4"/>
-              <w:right w:val="single" w:color="C9CFD8" w:sz="4"/>
-            </w:tcBorders>
-            <w:shd w:fill="F2F4F7" w:color="auto" w:val="clear"/>
-            <w:tcMar>
-              <w:top w:type="dxa" w:w="60"/>
-              <w:left w:type="dxa" w:w="100"/>
-              <w:bottom w:type="dxa" w:w="60"/>
-              <w:right w:type="dxa" w:w="100"/>
-            </w:tcMar>
-            <w:vAlign w:val="center"/>
-          </w:tcPr>
-          <w:p>
-            <w:pPr>
-              <w:spacing w:after="0"/>
-            </w:pPr>
-            <w:r>
-              <w:rPr>
-                <w:rFonts w:ascii="Calibri" w:cs="Calibri" w:eastAsia="Calibri" w:hAnsi="Calibri"/>
-                <w:b w:val="false"/>
-                <w:bCs w:val="false"/>
-                <w:sz w:val="19"/>
-                <w:szCs w:val="19"/>
-              </w:rPr>
-              <w:t xml:space="preserve">La fiche de décisions remplie et validée.</w:t>
+              <w:t xml:space="preserve">Une sortie nette, à l'heure.</w:t>
             </w:r>
           </w:p>
         </w:tc>
@@ -3031,7 +2823,37 @@
           <w:sz w:val="26"/>
           <w:szCs w:val="26"/>
         </w:rPr>
-        <w:t xml:space="preserve">3.2 Règles d'animation</w:t>
+        <w:t xml:space="preserve">3.2 Les ateliers métiers de la semaine</w:t>
+      </w:r>
+    </w:p>
+    <w:p>
+      <w:pPr>
+        <w:spacing w:after="140" w:before="0"/>
+      </w:pPr>
+      <w:r>
+        <w:rPr>
+          <w:rFonts w:ascii="Calibri" w:cs="Calibri" w:eastAsia="Calibri" w:hAnsi="Calibri"/>
+          <w:sz w:val="22"/>
+          <w:szCs w:val="22"/>
+        </w:rPr>
+        <w:t xml:space="preserve">Transport, BTP et immobilier se traitent en trois ateliers de trente minutes, mercredi 14 ou jeudi 15 octobre, chacun avec le seul référent concerné, sur place ou à distance. Vous utilisez les fiches 4.2 à 4.4. Vous repartez avec les listes flotte, chantiers et biens, ou leur date de remise. Les créneaux sont fixés en séance le mardi, dans la séquence des décisions.</w:t>
+      </w:r>
+    </w:p>
+    <w:p>
+      <w:pPr>
+        <w:pStyle w:val="Heading2"/>
+        <w:spacing w:after="120" w:before="280"/>
+      </w:pPr>
+      <w:r>
+        <w:rPr>
+          <w:rFonts w:ascii="Calibri" w:cs="Calibri" w:eastAsia="Calibri" w:hAnsi="Calibri"/>
+          <w:b/>
+          <w:bCs/>
+          <w:color w:val="1C1E6B"/>
+          <w:sz w:val="26"/>
+          <w:szCs w:val="26"/>
+        </w:rPr>
+        <w:t xml:space="preserve">3.3 Règles d'animation</w:t>
       </w:r>
     </w:p>
     <w:p>
@@ -3049,7 +2871,7 @@
           <w:sz w:val="22"/>
           <w:szCs w:val="22"/>
         </w:rPr>
-        <w:t xml:space="preserve">Vous tenez l'horaire. Un sujet qui déborde se termine par une question ouverte inscrite au compte rendu, avec un responsable et une date, pas par un dépassement.</w:t>
+        <w:t xml:space="preserve">Vous tenez l'horaire, et en deux heures il est serré. Un sujet qui déborde se termine par une question ouverte inscrite au compte rendu, avec un responsable et une date, ou par un atelier de trente minutes fixé dans la semaine. Jamais par un dépassement.</w:t>
       </w:r>
     </w:p>
     <w:p>

</xml_diff>